<commit_message>
feat: Update mockGenerator, templates, mailer logic and refine frontend/backend modules
</commit_message>
<xml_diff>
--- a/docs/Báo cáo tuần 23_9 tới 27_9.docx
+++ b/docs/Báo cáo tuần 23_9 tới 27_9.docx
@@ -276,6 +276,9 @@
         <w:jc w:val="center"/>
       </w:pPr>
       <w:r>
+        <w:rPr>
+          <w:noProof/>
+        </w:rPr>
         <w:drawing>
           <wp:inline distT="0" distB="0" distL="0" distR="0" wp14:anchorId="5E835B2E" wp14:editId="3636E302">
             <wp:extent cx="5943600" cy="2061210"/>
@@ -412,6 +415,9 @@
         <w:jc w:val="center"/>
       </w:pPr>
       <w:r>
+        <w:rPr>
+          <w:noProof/>
+        </w:rPr>
         <w:drawing>
           <wp:inline distT="0" distB="0" distL="0" distR="0" wp14:anchorId="474AA3D7" wp14:editId="2C8BFD33">
             <wp:extent cx="5943600" cy="2155190"/>
@@ -461,13 +467,7 @@
         <w:sym w:font="Wingdings" w:char="F0E8"/>
       </w:r>
       <w:r>
-        <w:t xml:space="preserve"> </w:t>
-      </w:r>
-      <w:r>
-        <w:t>Luồng xử lý</w:t>
-      </w:r>
-      <w:r>
-        <w:t xml:space="preserve">: </w:t>
+        <w:t xml:space="preserve"> Luồng xử lý: </w:t>
       </w:r>
       <w:r>
         <w:t>Kịch bản cũng xài WAF có sẵn các bộ quy tắc dò tìm thẻ &lt;script&gt;, &lt;alert&gt;… được thêm vào. Sau khi dò tìm, WAF sẽ chặn đứng và đẩy sang n8n. Thông tin được giả lập dùng Regex trích suất các đường link kiểm tra, nhánh true sẽ gửi mail và gửi lên hệ thống</w:t>
@@ -526,6 +526,9 @@
         <w:jc w:val="center"/>
       </w:pPr>
       <w:r>
+        <w:rPr>
+          <w:noProof/>
+        </w:rPr>
         <w:lastRenderedPageBreak/>
         <w:drawing>
           <wp:inline distT="0" distB="0" distL="0" distR="0" wp14:anchorId="49E03A72" wp14:editId="363F8C5D">
@@ -576,10 +579,7 @@
         <w:sym w:font="Wingdings" w:char="F0E8"/>
       </w:r>
       <w:r>
-        <w:t xml:space="preserve"> </w:t>
-      </w:r>
-      <w:r>
-        <w:t>Luồng xử lý:</w:t>
+        <w:t xml:space="preserve"> Luồng xử lý:</w:t>
       </w:r>
       <w:r>
         <w:t xml:space="preserve"> Kịch bản nhận thông tin trong payload có chứa user_role. N8n check quyền người thực thi đang sử dụng là ai. Nhánh kiểm tra diễn ra, nếu true thì chức danh chênh lệch mà tương tác quyền chỉnh sửa, xem đơn hàng người khác thì sẽ cảnh báo vi phạm và thu hồi token và gửi lên hẹ thống. Nếu sai thì trả thông báo nhầm.</w:t>
@@ -602,15 +602,7 @@
         <w:t>Credential Stuffing</w:t>
       </w:r>
       <w:r>
-        <w:t xml:space="preserve">: Tấn công thông tin đăng nhập thông qua rò rỉ dữ liệu có được thông qua </w:t>
-      </w:r>
-      <w:proofErr w:type="gramStart"/>
-      <w:r>
-        <w:t>dark-web</w:t>
-      </w:r>
-      <w:proofErr w:type="gramEnd"/>
-      <w:r>
-        <w:t xml:space="preserve">, bán dữ liệu kênh không chính thống lộ từ gmail/tên đăng nhập/mật khẩu trên internet. Xuất phát từ thói quen dùng nhiều tài khoản với 1 mật khẩu chung, tạo điều kiện cho hacker xâm nhập. Thông qua việc thử hàng loạt các dữ liệu rò rỉ, hacker thường sử dụng bot, proxy và các thủ thuật khác </w:t>
+        <w:t xml:space="preserve">: Tấn công thông tin đăng nhập thông qua rò rỉ dữ liệu có được thông qua dark-web, bán dữ liệu kênh không chính thống lộ từ gmail/tên đăng nhập/mật khẩu trên internet. Xuất phát từ thói quen dùng nhiều tài khoản với 1 mật khẩu chung, tạo điều kiện cho hacker xâm nhập. Thông qua việc thử hàng loạt các dữ liệu rò rỉ, hacker thường sử dụng bot, proxy và các thủ thuật khác </w:t>
       </w:r>
       <w:r>
         <w:t>để vượt qua cơ chế bảo mật. Thông qua 5 bước cơ bản:</w:t>
@@ -629,13 +621,7 @@
         <w:pStyle w:val="low12"/>
       </w:pPr>
       <w:r>
-        <w:t xml:space="preserve">Sử </w:t>
-      </w:r>
-      <w:r>
-        <w:t>dụng bot tự động kết hợp proxy hoặc botnet để thay đổi IP liên tục và tránh bị phát hiện</w:t>
-      </w:r>
-      <w:r>
-        <w:t>.</w:t>
+        <w:t>Sử dụng bot tự động kết hợp proxy hoặc botnet để thay đổi IP liên tục và tránh bị phát hiện.</w:t>
       </w:r>
     </w:p>
     <w:p>
@@ -676,6 +662,9 @@
         <w:jc w:val="center"/>
       </w:pPr>
       <w:r>
+        <w:rPr>
+          <w:noProof/>
+        </w:rPr>
         <w:lastRenderedPageBreak/>
         <w:drawing>
           <wp:inline distT="0" distB="0" distL="0" distR="0" wp14:anchorId="6D8C5126" wp14:editId="3494EA28">
@@ -768,6 +757,9 @@
         <w:jc w:val="center"/>
       </w:pPr>
       <w:r>
+        <w:rPr>
+          <w:noProof/>
+        </w:rPr>
         <w:drawing>
           <wp:inline distT="0" distB="0" distL="0" distR="0" wp14:anchorId="79A827F9" wp14:editId="5C3A7FFC">
             <wp:extent cx="5943600" cy="2331085"/>
@@ -826,10 +818,7 @@
         <w:ind w:right="-720"/>
       </w:pPr>
       <w:r>
-        <w:t xml:space="preserve">Kịch bản bổ sung </w:t>
-      </w:r>
-      <w:r>
-        <w:t>cho phần mềm n8n</w:t>
+        <w:t>Kịch bản bổ sung cho phần mềm n8n</w:t>
       </w:r>
     </w:p>
     <w:p>
@@ -839,13 +828,15 @@
       </w:pPr>
       <w:r>
         <w:lastRenderedPageBreak/>
-        <w:t>Khởi tạo 3 model chính</w:t>
-      </w:r>
-    </w:p>
-    <w:p>
-      <w:pPr>
-        <w:spacing w:line="360" w:lineRule="auto"/>
-        <w:ind w:left="720"/>
+        <w:t xml:space="preserve">Khởi tạo </w:t>
+      </w:r>
+      <w:r>
+        <w:t>4 model</w:t>
+      </w:r>
+    </w:p>
+    <w:p>
+      <w:pPr>
+        <w:pStyle w:val="medium"/>
       </w:pPr>
       <w:r>
         <w:t>Alert.js: bao gồm các cảnh báo giả dùng cho các trường hợp sản sinh ra để</w:t>
@@ -928,8 +919,22 @@
       <w:r>
         <w:t>status: trạng thái xử lý</w:t>
       </w:r>
-      <w:r>
-        <w:t>.</w:t>
+    </w:p>
+    <w:p>
+      <w:pPr>
+        <w:pStyle w:val="low12"/>
+      </w:pPr>
+      <w:r>
+        <w:t>t</w:t>
+      </w:r>
+      <w:r>
+        <w:t>ags: nhãn gián</w:t>
+      </w:r>
+      <w:r>
+        <w:t xml:space="preserve"> cờ</w:t>
+      </w:r>
+      <w:r>
+        <w:t xml:space="preserve"> chống trùng lặp.</w:t>
       </w:r>
     </w:p>
     <w:p>
@@ -941,47 +946,6 @@
           <w:rFonts w:cs="Times New Roman"/>
         </w:rPr>
       </w:pPr>
-      <w:r>
-        <w:rPr>
-          <w:rFonts w:cs="Times New Roman"/>
-          <w:noProof/>
-        </w:rPr>
-        <w:drawing>
-          <wp:inline distT="0" distB="0" distL="0" distR="0" wp14:anchorId="12655D7B" wp14:editId="55BFF2E0">
-            <wp:extent cx="4025900" cy="3532932"/>
-            <wp:effectExtent l="0" t="0" r="0" b="0"/>
-            <wp:docPr id="95204625" name="Picture 1"/>
-            <wp:cNvGraphicFramePr>
-              <a:graphicFrameLocks xmlns:a="http://schemas.openxmlformats.org/drawingml/2006/main" noChangeAspect="1"/>
-            </wp:cNvGraphicFramePr>
-            <a:graphic xmlns:a="http://schemas.openxmlformats.org/drawingml/2006/main">
-              <a:graphicData uri="http://schemas.openxmlformats.org/drawingml/2006/picture">
-                <pic:pic xmlns:pic="http://schemas.openxmlformats.org/drawingml/2006/picture">
-                  <pic:nvPicPr>
-                    <pic:cNvPr id="95204625" name=""/>
-                    <pic:cNvPicPr/>
-                  </pic:nvPicPr>
-                  <pic:blipFill>
-                    <a:blip r:embed="rId11"/>
-                    <a:stretch>
-                      <a:fillRect/>
-                    </a:stretch>
-                  </pic:blipFill>
-                  <pic:spPr>
-                    <a:xfrm>
-                      <a:off x="0" y="0"/>
-                      <a:ext cx="4043287" cy="3548190"/>
-                    </a:xfrm>
-                    <a:prstGeom prst="rect">
-                      <a:avLst/>
-                    </a:prstGeom>
-                  </pic:spPr>
-                </pic:pic>
-              </a:graphicData>
-            </a:graphic>
-          </wp:inline>
-        </w:drawing>
-      </w:r>
     </w:p>
     <w:p>
       <w:pPr>
@@ -996,51 +960,141 @@
         <w:pStyle w:val="low12"/>
       </w:pPr>
       <w:r>
+        <w:t>execution_id: mã định danh log</w:t>
+      </w:r>
+    </w:p>
+    <w:p>
+      <w:pPr>
+        <w:pStyle w:val="low12"/>
+      </w:pPr>
+      <w:r>
+        <w:t>alert_id: mã định danh kết nối với bảng Alert</w:t>
+      </w:r>
+    </w:p>
+    <w:p>
+      <w:pPr>
+        <w:pStyle w:val="low12"/>
+      </w:pPr>
+      <w:r>
+        <w:t>step_name: thao tác đã làm</w:t>
+      </w:r>
+    </w:p>
+    <w:p>
+      <w:pPr>
+        <w:pStyle w:val="low12"/>
+      </w:pPr>
+      <w:r>
+        <w:t>message: nội dung thông báo</w:t>
+      </w:r>
+    </w:p>
+    <w:p>
+      <w:pPr>
+        <w:pStyle w:val="low12"/>
+      </w:pPr>
+      <w:r>
+        <w:t>status: trạng thái xử lý, chuyển sang thành mặc định là SUCCESS</w:t>
+      </w:r>
+    </w:p>
+    <w:p>
+      <w:pPr>
+        <w:pStyle w:val="low12"/>
+      </w:pPr>
+      <w:r>
+        <w:t>timestamp: thời gian khởi tạo</w:t>
+      </w:r>
+    </w:p>
+    <w:p>
+      <w:pPr>
+        <w:pStyle w:val="low12"/>
+      </w:pPr>
+      <w:r>
+        <w:t>executed_by</w:t>
+      </w:r>
+      <w:r>
+        <w:t>: lưu trữ thông tin đối tượng người dùng đã thực hiện</w:t>
+      </w:r>
+      <w:r>
+        <w:t>.</w:t>
+      </w:r>
+    </w:p>
+    <w:p>
+      <w:pPr>
+        <w:pStyle w:val="low12"/>
+        <w:numPr>
+          <w:ilvl w:val="0"/>
+          <w:numId w:val="0"/>
+        </w:numPr>
+        <w:ind w:left="1440" w:hanging="360"/>
+      </w:pPr>
+    </w:p>
+    <w:p>
+      <w:pPr>
+        <w:pStyle w:val="medium"/>
+      </w:pPr>
+      <w:r>
+        <w:t>EmailTemplate</w:t>
+      </w:r>
+      <w:r>
+        <w:t xml:space="preserve">.js: Hiển thị các nội dung </w:t>
+      </w:r>
+      <w:r>
+        <w:t>biểu mẫu tự động khi gửi thư phản hồi</w:t>
+      </w:r>
+    </w:p>
+    <w:p>
+      <w:pPr>
+        <w:pStyle w:val="low12"/>
+      </w:pPr>
+      <w:r>
+        <w:t>type: kịch bản email bị tấn công</w:t>
+      </w:r>
+    </w:p>
+    <w:p>
+      <w:pPr>
+        <w:pStyle w:val="low12"/>
+      </w:pPr>
+      <w:r>
         <w:lastRenderedPageBreak/>
-        <w:t>execution_id: mã định danh log</w:t>
-      </w:r>
-    </w:p>
-    <w:p>
-      <w:pPr>
-        <w:pStyle w:val="low12"/>
-      </w:pPr>
-      <w:r>
-        <w:t>alert_id: mã định danh kết nối với bảng Alert</w:t>
-      </w:r>
-    </w:p>
-    <w:p>
-      <w:pPr>
-        <w:pStyle w:val="low12"/>
-      </w:pPr>
-      <w:r>
-        <w:t>step_name: thao tác đã làm</w:t>
-      </w:r>
-    </w:p>
-    <w:p>
-      <w:pPr>
-        <w:pStyle w:val="low12"/>
-      </w:pPr>
-      <w:r>
-        <w:t>message: nội dung thông báo</w:t>
-      </w:r>
-    </w:p>
-    <w:p>
-      <w:pPr>
-        <w:pStyle w:val="low12"/>
-      </w:pPr>
-      <w:r>
-        <w:t>status: trạng thái xử lý, chuyển sang thành mặc định là SUCCESS</w:t>
-      </w:r>
-    </w:p>
-    <w:p>
-      <w:pPr>
-        <w:pStyle w:val="low12"/>
-      </w:pPr>
-      <w:r>
-        <w:t>timestamp: thời gian khởi tạo</w:t>
-      </w:r>
-      <w:r>
-        <w:t>.</w:t>
+        <w:t>subject: tiêu đồ email</w:t>
+      </w:r>
+    </w:p>
+    <w:p>
+      <w:pPr>
+        <w:pStyle w:val="low12"/>
+      </w:pPr>
+      <w:r>
+        <w:t xml:space="preserve">body: </w:t>
+      </w:r>
+      <w:r>
+        <w:t>n</w:t>
+      </w:r>
+      <w:r>
+        <w:t xml:space="preserve">ội dung chi tiết của email </w:t>
+      </w:r>
+    </w:p>
+    <w:p>
+      <w:pPr>
+        <w:pStyle w:val="low12"/>
+      </w:pPr>
+      <w:r>
+        <w:t xml:space="preserve">recipients: </w:t>
+      </w:r>
+      <w:r>
+        <w:t>d</w:t>
+      </w:r>
+      <w:r>
+        <w:t>anh sách email người nhận mặc định.</w:t>
+      </w:r>
+    </w:p>
+    <w:p>
+      <w:pPr>
+        <w:pStyle w:val="low12"/>
+      </w:pPr>
+      <w:r>
+        <w:t xml:space="preserve">cc: </w:t>
+      </w:r>
+      <w:r>
+        <w:t xml:space="preserve">danh sách bản </w:t>
       </w:r>
     </w:p>
     <w:p>

</xml_diff>